<commit_message>
Sync latest Kokeba source into Git repo
</commit_message>
<xml_diff>
--- a/docs/architecture/Kokeba_Platform_Blueprint.docx
+++ b/docs/architecture/Kokeba_Platform_Blueprint.docx
@@ -174,7 +174,7 @@
         <w:spacing w:after="160" w:line="276"/>
       </w:pPr>
       <w:r>
-        <w:t xml:space="preserve">Under the hood, Claude (via Claude Code) orchestrates a team of specialized agents — market intelligence, authoring, illustration, layout, compliance, and marketing — with an image-generation MCP and Canva for art and layout, and Amazon KDP as the storefront. Roughly 80–90% of the work is automated; the parts that stay human are cultural/linguistic review and the final KDP upload. A Compliance agent runs an automated pre-flight on every title so the platform stays inside platform rules, laws, and industry norms in every market.</w:t>
+        <w:t xml:space="preserve">Under the hood, Codex orchestrates a team of specialized agents — market intelligence, authoring, illustration, layout, compliance, and marketing — with an image-generation MCP and Canva for art and layout, and Amazon KDP as the storefront. Roughly 80–90% of the work is automated; the parts that stay human are cultural/linguistic review and the final KDP upload. A Compliance agent runs an automated pre-flight on every title so the platform stays inside platform rules, laws, and industry norms in every market.</w:t>
       </w:r>
     </w:p>
     <w:p>
@@ -5247,7 +5247,7 @@
               <w:spacing w:after="60" w:line="264"/>
             </w:pPr>
             <w:r>
-              <w:t xml:space="preserve">Better path: build a lean, purpose-built pipeline (Section 5) where Claude handles text/structure and Canva + an image MCP handle illustration and print-ready layout natively.</w:t>
+              <w:t xml:space="preserve">Better path: build a lean, purpose-built pipeline (Section 5) where Codex handles text/structure and Canva + an image MCP handle illustration and print-ready layout natively.</w:t>
             </w:r>
           </w:p>
         </w:tc>
@@ -5489,7 +5489,7 @@
         <w:spacing w:after="160" w:line="276"/>
       </w:pPr>
       <w:r>
-        <w:t xml:space="preserve">This is the core deliverable: a repeatable, scalable, agent-run workflow that turns a one-line book idea into print-ready and Kindle-ready files. Every stage is owned by a specialized AI agent; a Claude orchestrator coordinates them, maintains the tracker, and hands off to a human only at the two points that genuinely require judgment (language/culture review and the KDP upload). The agents are facilitated end-to-end — research, writing, illustration, layout, export, and metadata all run as agent steps — with the same controls-first philosophy used for marketing in Section 9.</w:t>
+        <w:t xml:space="preserve">This is the core deliverable: a repeatable, scalable, agent-run workflow that turns a one-line book idea into print-ready and Kindle-ready files. Every stage is owned by a specialized AI agent; a Codex orchestrator coordinates them, maintains the tracker, and hands off to a human only at the two points that genuinely require judgment (language/culture review and the KDP upload). The agents are facilitated end-to-end — research, writing, illustration, layout, export, and metadata all run as agent steps — with the same controls-first philosophy used for marketing in Section 9.</w:t>
       </w:r>
     </w:p>
     <w:p>
@@ -5783,7 +5783,7 @@
                 <w:b/>
                 <w:bCs/>
               </w:rPr>
-              <w:t xml:space="preserve">Orchestrator (Claude)</w:t>
+              <w:t xml:space="preserve">Orchestrator (Codex)</w:t>
             </w:r>
           </w:p>
         </w:tc>
@@ -5809,7 +5809,7 @@
               <w:spacing w:after="40" w:line="264"/>
             </w:pPr>
             <w:r>
-              <w:t xml:space="preserve">Claude / Claude Code</w:t>
+              <w:t xml:space="preserve">Codex</w:t>
             </w:r>
           </w:p>
         </w:tc>
@@ -5917,7 +5917,7 @@
               <w:spacing w:after="40" w:line="264"/>
             </w:pPr>
             <w:r>
-              <w:t xml:space="preserve">Claude</w:t>
+              <w:t xml:space="preserve">Codex</w:t>
             </w:r>
           </w:p>
         </w:tc>
@@ -6702,7 +6702,7 @@
         <w:spacing w:after="90" w:line="270"/>
       </w:pPr>
       <w:r>
-        <w:t xml:space="preserve">Claude researches comparable titles, suggested keywords, KDP categories, price band, and page count, and flags whether the niche is worth it.</w:t>
+        <w:t xml:space="preserve">Codex researches comparable titles, suggested keywords, KDP categories, price band, and page count, and flags whether the niche is worth it.</w:t>
       </w:r>
     </w:p>
     <w:p>
@@ -6736,7 +6736,7 @@
         <w:spacing w:after="90" w:line="270"/>
       </w:pPr>
       <w:r>
-        <w:t xml:space="preserve">Claude generates the full bilingual manuscript: Amharic (fidel), English, and Latin transliteration, page by page, plus a per-page illustration prompt.</w:t>
+        <w:t xml:space="preserve">Codex generates the full bilingual manuscript: Amharic (fidel), English, and Latin transliteration, page by page, plus a per-page illustration prompt.</w:t>
       </w:r>
     </w:p>
     <w:p>
@@ -6749,7 +6749,7 @@
         <w:spacing w:after="90" w:line="270"/>
       </w:pPr>
       <w:r>
-        <w:t xml:space="preserve">Claude writes a consistent "art bible" (character looks, palette, style) so every book in the series matches.</w:t>
+        <w:t xml:space="preserve">Codex writes a consistent "art bible" (character looks, palette, style) so every book in the series matches.</w:t>
       </w:r>
     </w:p>
     <w:p>
@@ -6770,7 +6770,148 @@
         <w:pStyle w:val="Heading3"/>
       </w:pPr>
       <w:r>
-        <w:t xml:space="preserve">Stage 3 — Native-speaker review (human gate #1)</w:t>
+        <w:t xml:space="preserve">Stage 3 — Illustration</w:t>
+      </w:r>
+    </w:p>
+    <w:p>
+      <w:pPr>
+        <w:pStyle w:val="ListParagraph"/>
+        <w:numPr>
+          <w:ilvl w:val="0"/>
+          <w:numId w:val="3"/>
+        </w:numPr>
+        <w:spacing w:after="90" w:line="270"/>
+      </w:pPr>
+      <w:r>
+        <w:t xml:space="preserve">Codex turns each page's art prompt into a generation call via the image MCP, reusing the art bible for consistency.</w:t>
+      </w:r>
+    </w:p>
+    <w:p>
+      <w:pPr>
+        <w:pStyle w:val="ListParagraph"/>
+        <w:numPr>
+          <w:ilvl w:val="0"/>
+          <w:numId w:val="3"/>
+        </w:numPr>
+        <w:spacing w:after="90" w:line="270"/>
+      </w:pPr>
+      <w:r>
+        <w:t xml:space="preserve">Generate, review, regenerate weak pages; hero/character art can be human-finished for IP and quality.</w:t>
+      </w:r>
+    </w:p>
+    <w:p>
+      <w:pPr>
+        <w:pStyle w:val="ListParagraph"/>
+        <w:numPr>
+          <w:ilvl w:val="0"/>
+          <w:numId w:val="3"/>
+        </w:numPr>
+        <w:spacing w:after="90" w:line="270"/>
+      </w:pPr>
+      <w:r>
+        <w:t xml:space="preserve">Output: page illustrations + cover art.</w:t>
+      </w:r>
+    </w:p>
+    <w:p>
+      <w:pPr>
+        <w:pStyle w:val="Heading3"/>
+      </w:pPr>
+      <w:r>
+        <w:t xml:space="preserve">Stage 4 — Layout &amp; design (Canva)</w:t>
+      </w:r>
+    </w:p>
+    <w:p>
+      <w:pPr>
+        <w:pStyle w:val="ListParagraph"/>
+        <w:numPr>
+          <w:ilvl w:val="0"/>
+          <w:numId w:val="3"/>
+        </w:numPr>
+        <w:spacing w:after="90" w:line="270"/>
+      </w:pPr>
+      <w:r>
+        <w:t xml:space="preserve">Via the Canva MCP, create a design from a reusable series template at your KDP trim (e.g., 8.5×8.5 in).</w:t>
+      </w:r>
+    </w:p>
+    <w:p>
+      <w:pPr>
+        <w:pStyle w:val="ListParagraph"/>
+        <w:numPr>
+          <w:ilvl w:val="0"/>
+          <w:numId w:val="3"/>
+        </w:numPr>
+        <w:spacing w:after="90" w:line="270"/>
+      </w:pPr>
+      <w:r>
+        <w:t xml:space="preserve">Place each illustration + text; EMBED the Country Pack script font (e.g. Noto Sans Ethiopic) so the fidel renders and prints (see 5.4).</w:t>
+      </w:r>
+    </w:p>
+    <w:p>
+      <w:pPr>
+        <w:pStyle w:val="ListParagraph"/>
+        <w:numPr>
+          <w:ilvl w:val="0"/>
+          <w:numId w:val="3"/>
+        </w:numPr>
+        <w:spacing w:after="90" w:line="270"/>
+      </w:pPr>
+      <w:r>
+        <w:t xml:space="preserve">Build the wrap-around cover (front, spine, back) for the final page count.</w:t>
+      </w:r>
+    </w:p>
+    <w:p>
+      <w:pPr>
+        <w:pStyle w:val="Heading3"/>
+      </w:pPr>
+      <w:r>
+        <w:t xml:space="preserve">Stage 5 — Export &amp; assembly</w:t>
+      </w:r>
+    </w:p>
+    <w:p>
+      <w:pPr>
+        <w:pStyle w:val="ListParagraph"/>
+        <w:numPr>
+          <w:ilvl w:val="0"/>
+          <w:numId w:val="3"/>
+        </w:numPr>
+        <w:spacing w:after="90" w:line="270"/>
+      </w:pPr>
+      <w:r>
+        <w:t xml:space="preserve">Export a print-ready interior PDF (trim + bleed) and a cover PDF, with all fonts embedded or outlined.</w:t>
+      </w:r>
+    </w:p>
+    <w:p>
+      <w:pPr>
+        <w:pStyle w:val="ListParagraph"/>
+        <w:numPr>
+          <w:ilvl w:val="0"/>
+          <w:numId w:val="3"/>
+        </w:numPr>
+        <w:spacing w:after="90" w:line="270"/>
+      </w:pPr>
+      <w:r>
+        <w:t xml:space="preserve">Produce the Kindle edition (fixed-layout for picture books).</w:t>
+      </w:r>
+    </w:p>
+    <w:p>
+      <w:pPr>
+        <w:pStyle w:val="ListParagraph"/>
+        <w:numPr>
+          <w:ilvl w:val="0"/>
+          <w:numId w:val="3"/>
+        </w:numPr>
+        <w:spacing w:after="90" w:line="270"/>
+      </w:pPr>
+      <w:r>
+        <w:t xml:space="preserve">Assemble metadata: title, subtitle, blurb, 7 keywords, 2 categories.</w:t>
+      </w:r>
+    </w:p>
+    <w:p>
+      <w:pPr>
+        <w:pStyle w:val="Heading3"/>
+      </w:pPr>
+      <w:r>
+        <w:t xml:space="preserve">Stage 6 — Collective native-speaker review (human gate #1)</w:t>
       </w:r>
     </w:p>
     <w:p>
@@ -6783,7 +6924,7 @@
         <w:spacing w:after="80" w:line="270"/>
       </w:pPr>
       <w:r>
-        <w:t xml:space="preserve">A fluent Amharic reviewer checks spelling of the fidel, dialect choices, transliteration, and cultural/faith accuracy. This is non-negotiable — AI still makes fidel and idiom errors. Cheap relative to the cost of a public mistake in a kids' book.</w:t>
+        <w:t xml:space="preserve">A fluent reviewer reviews the ASSEMBLED, font-embedded proof in ONE pass — English text, illustrations, and the fidel together: fidel spelling, dialect, transliteration, cultural/faith accuracy, and that the art matches the words. Done AFTER layout so the fidel renders correctly and the book is judged as a whole. Non-negotiable.</w:t>
       </w:r>
     </w:p>
     <w:p>
@@ -6791,7 +6932,41 @@
         <w:pStyle w:val="Heading3"/>
       </w:pPr>
       <w:r>
-        <w:t xml:space="preserve">Stage 4 — Illustration</w:t>
+        <w:t xml:space="preserve">Stage 7 — QA &amp; compliance (human gate #2)</w:t>
+      </w:r>
+    </w:p>
+    <w:p>
+      <w:pPr>
+        <w:pStyle w:val="ListParagraph"/>
+        <w:numPr>
+          <w:ilvl w:val="0"/>
+          <w:numId w:val="2"/>
+        </w:numPr>
+        <w:spacing w:after="80" w:line="270"/>
+      </w:pPr>
+      <w:r>
+        <w:t xml:space="preserve">Check trim/bleed/margins against KDP specs, fidel rendering in the exported PDF, image resolution (300 DPI), and that text isn't in the no-print margin. Use the KDP Previewer.</w:t>
+      </w:r>
+    </w:p>
+    <w:p>
+      <w:pPr>
+        <w:pStyle w:val="ListParagraph"/>
+        <w:numPr>
+          <w:ilvl w:val="0"/>
+          <w:numId w:val="2"/>
+        </w:numPr>
+        <w:spacing w:after="80" w:line="270"/>
+      </w:pPr>
+      <w:r>
+        <w:t xml:space="preserve">Confirm the AI-content disclosure answers you'll give at upload.</w:t>
+      </w:r>
+    </w:p>
+    <w:p>
+      <w:pPr>
+        <w:pStyle w:val="Heading3"/>
+      </w:pPr>
+      <w:r>
+        <w:t xml:space="preserve">Stage 8 — Publish &amp; track</w:t>
       </w:r>
     </w:p>
     <w:p>
@@ -6804,7 +6979,7 @@
         <w:spacing w:after="90" w:line="270"/>
       </w:pPr>
       <w:r>
-        <w:t xml:space="preserve">Claude turns each page's art prompt into a generation call via the image MCP, reusing the art-bible description for consistency.</w:t>
+        <w:t xml:space="preserve">Manually upload interior + cover + metadata to KDP (no API), select print + Kindle, and submit the AI disclosure.</w:t>
       </w:r>
     </w:p>
     <w:p>
@@ -6817,182 +6992,7 @@
         <w:spacing w:after="90" w:line="270"/>
       </w:pPr>
       <w:r>
-        <w:t xml:space="preserve">Generate, review, regenerate weak pages. Hero/character art can be human-finished for IP and quality.</w:t>
-      </w:r>
-    </w:p>
-    <w:p>
-      <w:pPr>
-        <w:pStyle w:val="ListParagraph"/>
-        <w:numPr>
-          <w:ilvl w:val="0"/>
-          <w:numId w:val="3"/>
-        </w:numPr>
-        <w:spacing w:after="90" w:line="270"/>
-      </w:pPr>
-      <w:r>
-        <w:t xml:space="preserve">Output: a folder of page illustrations + cover art.</w:t>
-      </w:r>
-    </w:p>
-    <w:p>
-      <w:pPr>
-        <w:pStyle w:val="Heading3"/>
-      </w:pPr>
-      <w:r>
-        <w:t xml:space="preserve">Stage 5 — Layout &amp; design (Canva)</w:t>
-      </w:r>
-    </w:p>
-    <w:p>
-      <w:pPr>
-        <w:pStyle w:val="ListParagraph"/>
-        <w:numPr>
-          <w:ilvl w:val="0"/>
-          <w:numId w:val="3"/>
-        </w:numPr>
-        <w:spacing w:after="90" w:line="270"/>
-      </w:pPr>
-      <w:r>
-        <w:t xml:space="preserve">Via the Canva MCP, create a design from a reusable series template sized to your KDP trim (e.g., 8.5×8.5 in).</w:t>
-      </w:r>
-    </w:p>
-    <w:p>
-      <w:pPr>
-        <w:pStyle w:val="ListParagraph"/>
-        <w:numPr>
-          <w:ilvl w:val="0"/>
-          <w:numId w:val="3"/>
-        </w:numPr>
-        <w:spacing w:after="90" w:line="270"/>
-      </w:pPr>
-      <w:r>
-        <w:t xml:space="preserve">Place each illustration and its bilingual text; apply an embedded Amharic font (e.g., Noto Sans/Serif Ethiopic) so the fidel renders correctly.</w:t>
-      </w:r>
-    </w:p>
-    <w:p>
-      <w:pPr>
-        <w:pStyle w:val="ListParagraph"/>
-        <w:numPr>
-          <w:ilvl w:val="0"/>
-          <w:numId w:val="3"/>
-        </w:numPr>
-        <w:spacing w:after="90" w:line="270"/>
-      </w:pPr>
-      <w:r>
-        <w:t xml:space="preserve">Build the wrap-around cover (front, spine, back) to KDP's template for the final page count.</w:t>
-      </w:r>
-    </w:p>
-    <w:p>
-      <w:pPr>
-        <w:pStyle w:val="Heading3"/>
-      </w:pPr>
-      <w:r>
-        <w:t xml:space="preserve">Stage 6 — Export &amp; assembly</w:t>
-      </w:r>
-    </w:p>
-    <w:p>
-      <w:pPr>
-        <w:pStyle w:val="ListParagraph"/>
-        <w:numPr>
-          <w:ilvl w:val="0"/>
-          <w:numId w:val="3"/>
-        </w:numPr>
-        <w:spacing w:after="90" w:line="270"/>
-      </w:pPr>
-      <w:r>
-        <w:t xml:space="preserve">Export a print-ready interior PDF (correct trim + bleed) and a cover PDF from Canva.</w:t>
-      </w:r>
-    </w:p>
-    <w:p>
-      <w:pPr>
-        <w:pStyle w:val="ListParagraph"/>
-        <w:numPr>
-          <w:ilvl w:val="0"/>
-          <w:numId w:val="3"/>
-        </w:numPr>
-        <w:spacing w:after="90" w:line="270"/>
-      </w:pPr>
-      <w:r>
-        <w:t xml:space="preserve">Produce the Kindle edition (reflowable EPUB or fixed-layout for picture books).</w:t>
-      </w:r>
-    </w:p>
-    <w:p>
-      <w:pPr>
-        <w:pStyle w:val="ListParagraph"/>
-        <w:numPr>
-          <w:ilvl w:val="0"/>
-          <w:numId w:val="3"/>
-        </w:numPr>
-        <w:spacing w:after="90" w:line="270"/>
-      </w:pPr>
-      <w:r>
-        <w:t xml:space="preserve">Claude assembles metadata: title, subtitle, description/blurb, 7 keywords, 2 categories, author bio.</w:t>
-      </w:r>
-    </w:p>
-    <w:p>
-      <w:pPr>
-        <w:pStyle w:val="Heading3"/>
-      </w:pPr>
-      <w:r>
-        <w:t xml:space="preserve">Stage 7 — QA &amp; compliance (human gate #2)</w:t>
-      </w:r>
-    </w:p>
-    <w:p>
-      <w:pPr>
-        <w:pStyle w:val="ListParagraph"/>
-        <w:numPr>
-          <w:ilvl w:val="0"/>
-          <w:numId w:val="2"/>
-        </w:numPr>
-        <w:spacing w:after="80" w:line="270"/>
-      </w:pPr>
-      <w:r>
-        <w:t xml:space="preserve">Check trim/bleed/margins against KDP specs, fidel rendering in the exported PDF, image resolution (300 DPI), and that text isn't in the no-print margin. Use the KDP Previewer.</w:t>
-      </w:r>
-    </w:p>
-    <w:p>
-      <w:pPr>
-        <w:pStyle w:val="ListParagraph"/>
-        <w:numPr>
-          <w:ilvl w:val="0"/>
-          <w:numId w:val="2"/>
-        </w:numPr>
-        <w:spacing w:after="80" w:line="270"/>
-      </w:pPr>
-      <w:r>
-        <w:t xml:space="preserve">Confirm the AI-content disclosure answers you'll give at upload.</w:t>
-      </w:r>
-    </w:p>
-    <w:p>
-      <w:pPr>
-        <w:pStyle w:val="Heading3"/>
-      </w:pPr>
-      <w:r>
-        <w:t xml:space="preserve">Stage 8 — Publish &amp; track</w:t>
-      </w:r>
-    </w:p>
-    <w:p>
-      <w:pPr>
-        <w:pStyle w:val="ListParagraph"/>
-        <w:numPr>
-          <w:ilvl w:val="0"/>
-          <w:numId w:val="3"/>
-        </w:numPr>
-        <w:spacing w:after="90" w:line="270"/>
-      </w:pPr>
-      <w:r>
-        <w:t xml:space="preserve">Manually upload interior + cover + metadata to KDP (no API), select print + Kindle, and submit the AI disclosure.</w:t>
-      </w:r>
-    </w:p>
-    <w:p>
-      <w:pPr>
-        <w:pStyle w:val="ListParagraph"/>
-        <w:numPr>
-          <w:ilvl w:val="0"/>
-          <w:numId w:val="3"/>
-        </w:numPr>
-        <w:spacing w:after="90" w:line="270"/>
-      </w:pPr>
-      <w:r>
-        <w:t xml:space="preserve">Log the title in your Airtable/Notion tracker; after launch, Claude can draft listing copy, social posts, and an email to the community.</w:t>
+        <w:t xml:space="preserve">Log the title in your Airtable/Notion tracker; after launch, Codex can draft listing copy, social posts, and an email to the community.</w:t>
       </w:r>
     </w:p>
     <w:p>
@@ -7702,7 +7702,7 @@
               <w:spacing w:after="60" w:line="264"/>
             </w:pPr>
             <w:r>
-              <w:t xml:space="preserve">Mitigations baked into this plan: do layout in Canva (not LaTeX) with an embedded Ethiopic font; always run native-speaker review (Stage 3); and outline/embed fonts at export so KDP renders them correctly. This is exactly why the custom pipeline beats the off-the-shelf repo.</w:t>
+              <w:t xml:space="preserve">Mitigations baked into this plan: do layout in Canva (not LaTeX) with an embedded Ethiopic font; always run native-speaker review (Stage 6); and outline/embed fonts at export so KDP renders them correctly. This is exactly why the custom pipeline beats the off-the-shelf repo.</w:t>
             </w:r>
           </w:p>
         </w:tc>
@@ -10621,7 +10621,7 @@
               <w:spacing w:after="40" w:line="264"/>
             </w:pPr>
             <w:r>
-              <w:t xml:space="preserve">AI text (Claude)</w:t>
+              <w:t xml:space="preserve">AI text (Codex)</w:t>
             </w:r>
           </w:p>
         </w:tc>
@@ -12625,7 +12625,7 @@
         <w:spacing w:after="80" w:line="270"/>
       </w:pPr>
       <w:r>
-        <w:t xml:space="preserve">Same pipeline, new output. Claude writes the songs/scripts; the image MCP + animation tools and AI voice/music produce episodes; you compile 8-12 short segments into a 30-minute show.</w:t>
+        <w:t xml:space="preserve">Same pipeline, new output. Codex writes the songs/scripts; the image MCP + animation tools and AI voice/music produce episodes; you compile 8-12 short segments into a 30-minute show.</w:t>
       </w:r>
     </w:p>
     <w:p>
@@ -13460,7 +13460,7 @@
         <w:spacing w:after="160" w:line="276"/>
       </w:pPr>
       <w:r>
-        <w:t xml:space="preserve">Each agent owns one job, touches one set of tools, and reports to a Claude orchestrator. The right-hand column is the control gate - what the agent may do on its own versus what needs your sign-off.</w:t>
+        <w:t xml:space="preserve">Each agent owns one job, touches one set of tools, and reports to a Codex orchestrator. The right-hand column is the control gate - what the agent may do on its own versus what needs your sign-off.</w:t>
       </w:r>
     </w:p>
     <w:tbl>
@@ -14190,7 +14190,7 @@
                 <w:b/>
                 <w:bCs/>
               </w:rPr>
-              <w:t xml:space="preserve">Orchestrator (Claude)</w:t>
+              <w:t xml:space="preserve">Orchestrator (Codex)</w:t>
             </w:r>
           </w:p>
         </w:tc>
@@ -17620,7 +17620,7 @@
               <w:spacing w:after="40" w:line="264"/>
             </w:pPr>
             <w:r>
-              <w:t xml:space="preserve">Mandatory native-speaker review every book (Stage 3); never publish unreviewed.</w:t>
+              <w:t xml:space="preserve">Mandatory native-speaker review every book (Stage 6, collective); never publish unreviewed.</w:t>
             </w:r>
           </w:p>
         </w:tc>
@@ -18545,7 +18545,7 @@
       <w:r>
         <w:t xml:space="preserve">Sisters Aim to Build Ethiopia's Reading Culture — VOA — </w:t>
       </w:r>
-      <w:hyperlink w:history="1" r:id="rIdsvdscxdpqcclozwja8nyb">
+      <w:hyperlink w:history="1" r:id="rIdt3pspc9udqaka-gyoyw4x">
         <w:r>
           <w:rPr>
             <w:rStyle w:val="Hyperlink"/>
@@ -18561,7 +18561,7 @@
       <w:r>
         <w:t xml:space="preserve">A simple Amharic alphabets learning book for Diaspora Children (series) — Amazon — </w:t>
       </w:r>
-      <w:hyperlink w:history="1" r:id="rIda-m2z0x-vk3wn_jtytquh">
+      <w:hyperlink w:history="1" r:id="rIdg2pk_uw1uqk5ophalkxeu">
         <w:r>
           <w:rPr>
             <w:rStyle w:val="Hyperlink"/>
@@ -18577,7 +18577,7 @@
       <w:r>
         <w:t xml:space="preserve">Amharic Alphabet Picture Book (Kiazpora) — Amazon — </w:t>
       </w:r>
-      <w:hyperlink w:history="1" r:id="rIdanyxmbrqvkrbgcqb6q2j-">
+      <w:hyperlink w:history="1" r:id="rId_iew2qsmlmpfsmezfdgbc">
         <w:r>
           <w:rPr>
             <w:rStyle w:val="Hyperlink"/>
@@ -18593,7 +18593,7 @@
       <w:r>
         <w:t xml:space="preserve">My Ethiopian Amharic Alphabet Coloring Book — Amazon — </w:t>
       </w:r>
-      <w:hyperlink w:history="1" r:id="rIdxdkq8_cuhm2uvunpfea2q">
+      <w:hyperlink w:history="1" r:id="rId3ookuoe7nut52wxha36c6">
         <w:r>
           <w:rPr>
             <w:rStyle w:val="Hyperlink"/>
@@ -18609,7 +18609,7 @@
       <w:r>
         <w:t xml:space="preserve">Exploring Amharic: Alphabet, Numbers &amp; Ethiopian Calendar — Amazon — </w:t>
       </w:r>
-      <w:hyperlink w:history="1" r:id="rIdox6dwnesrdcv5zbfichnx">
+      <w:hyperlink w:history="1" r:id="rIdy5ailjojy_8ofm0yu2y7t">
         <w:r>
           <w:rPr>
             <w:rStyle w:val="Hyperlink"/>
@@ -18625,7 +18625,7 @@
       <w:r>
         <w:t xml:space="preserve">Amharic for Foreigners and the Ethiopian Diaspora — Amazon — </w:t>
       </w:r>
-      <w:hyperlink w:history="1" r:id="rIdp94mhu--aopgd9m9mgmr9">
+      <w:hyperlink w:history="1" r:id="rId2phzotptiq-drlb5ha6ot">
         <w:r>
           <w:rPr>
             <w:rStyle w:val="Hyperlink"/>
@@ -18641,7 +18641,7 @@
       <w:r>
         <w:t xml:space="preserve">Tsehai Publishers — Ethiopian children's books — </w:t>
       </w:r>
-      <w:hyperlink w:history="1" r:id="rIdjsxowwuzkrg9h_bbvwazk">
+      <w:hyperlink w:history="1" r:id="rId3ogpq0z6_xc0kpeqofp-m">
         <w:r>
           <w:rPr>
             <w:rStyle w:val="Hyperlink"/>
@@ -18657,7 +18657,7 @@
       <w:r>
         <w:t xml:space="preserve">Is there a KDP API? — KDP Community — </w:t>
       </w:r>
-      <w:hyperlink w:history="1" r:id="rIdwlzg6rqj4y9im7fjsaqem">
+      <w:hyperlink w:history="1" r:id="rId0i8w8vtmfidzvumvmpehn">
         <w:r>
           <w:rPr>
             <w:rStyle w:val="Hyperlink"/>
@@ -18673,7 +18673,7 @@
       <w:r>
         <w:t xml:space="preserve">Amazon KDP AI Disclosure Policy 2026 — Inkfluence AI — </w:t>
       </w:r>
-      <w:hyperlink w:history="1" r:id="rIdd1i2_mcneogpnt2tqx4pv">
+      <w:hyperlink w:history="1" r:id="rIdkae79xscltfkyzababnir">
         <w:r>
           <w:rPr>
             <w:rStyle w:val="Hyperlink"/>
@@ -18689,7 +18689,7 @@
       <w:r>
         <w:t xml:space="preserve">Will Amazon KDP Accept AI-Illustrated Children's Books? — Neolemon — </w:t>
       </w:r>
-      <w:hyperlink w:history="1" r:id="rIdmibwamob6f3sryq1szlui">
+      <w:hyperlink w:history="1" r:id="rIdl-2jtqjof_zdcbgpwtgkp">
         <w:r>
           <w:rPr>
             <w:rStyle w:val="Hyperlink"/>
@@ -18705,7 +18705,7 @@
       <w:r>
         <w:t xml:space="preserve">AI Children's Book Copyright: Legal Guide (2026) — Neolemon — </w:t>
       </w:r>
-      <w:hyperlink w:history="1" r:id="rIdiqp79hglx2ojktwl0eat8">
+      <w:hyperlink w:history="1" r:id="rId2-re7vpt3mpjfjzsvv38i">
         <w:r>
           <w:rPr>
             <w:rStyle w:val="Hyperlink"/>
@@ -18721,7 +18721,7 @@
       <w:r>
         <w:t xml:space="preserve">KDP Content Guidelines (official) — </w:t>
       </w:r>
-      <w:hyperlink w:history="1" r:id="rIdiw3s1zuc_ql_idiifyxek">
+      <w:hyperlink w:history="1" r:id="rIdszlmgbmw1ie9dvdi1e6hz">
         <w:r>
           <w:rPr>
             <w:rStyle w:val="Hyperlink"/>
@@ -18737,7 +18737,7 @@
       <w:r>
         <w:t xml:space="preserve">wesleyscholl/book-generator — GitHub — </w:t>
       </w:r>
-      <w:hyperlink w:history="1" r:id="rIdckzzahqb4hpao1agvilif">
+      <w:hyperlink w:history="1" r:id="rIdsfmfrgh_q3xurafwbjj7k">
         <w:r>
           <w:rPr>
             <w:rStyle w:val="Hyperlink"/>
@@ -18753,7 +18753,7 @@
       <w:r>
         <w:t xml:space="preserve">How Much Can You Make Selling Children's Books on KDP? — Neolemon — </w:t>
       </w:r>
-      <w:hyperlink w:history="1" r:id="rIdqmzhoeme0vto0yxjngtpx">
+      <w:hyperlink w:history="1" r:id="rId5-g5xlxz55whryf0tpdf3">
         <w:r>
           <w:rPr>
             <w:rStyle w:val="Hyperlink"/>
@@ -18769,7 +18769,7 @@
       <w:r>
         <w:t xml:space="preserve">14 Kids Activity Book Niches That Earn $1k+ on KDP — KDP Easy — </w:t>
       </w:r>
-      <w:hyperlink w:history="1" r:id="rIdqvpuycjcf9yumfrh1ijeo">
+      <w:hyperlink w:history="1" r:id="rIdbx7br9ijq4rvi8o4v_61-">
         <w:r>
           <w:rPr>
             <w:rStyle w:val="Hyperlink"/>
@@ -18785,7 +18785,7 @@
       <w:r>
         <w:t xml:space="preserve">Best-Selling Kids Formats and Niches — Book Bolt — </w:t>
       </w:r>
-      <w:hyperlink w:history="1" r:id="rId5akffp8xidoi8nsf7wkmu">
+      <w:hyperlink w:history="1" r:id="rIdtxkhydij7nepnluodnuqs">
         <w:r>
           <w:rPr>
             <w:rStyle w:val="Hyperlink"/>
@@ -18801,7 +18801,7 @@
       <w:r>
         <w:t xml:space="preserve">The Secret to Profitable Kids' Books on KDP (2025) — Vocal Media — </w:t>
       </w:r>
-      <w:hyperlink w:history="1" r:id="rIdsqqa-ncpfq9x5liugsixl">
+      <w:hyperlink w:history="1" r:id="rIdtmkifevrxjamaezjn46jt">
         <w:r>
           <w:rPr>
             <w:rStyle w:val="Hyperlink"/>
@@ -18817,7 +18817,7 @@
       <w:r>
         <w:t xml:space="preserve">Kindle Publishing in 2026: How Much Do Self-Published Authors Make? — ZonGuru — </w:t>
       </w:r>
-      <w:hyperlink w:history="1" r:id="rIdxkmalkzv_1lpn6whvxfn8">
+      <w:hyperlink w:history="1" r:id="rIdjknk1nye-jc8shjapoodx">
         <w:r>
           <w:rPr>
             <w:rStyle w:val="Hyperlink"/>
@@ -18833,7 +18833,7 @@
       <w:r>
         <w:t xml:space="preserve">CoComelon: from YouTube show to $3B empire — Fortune — </w:t>
       </w:r>
-      <w:hyperlink w:history="1" r:id="rIdziie57h53-smzho4yiye9">
+      <w:hyperlink w:history="1" r:id="rId66pyzu-tpkohsicewy2lc">
         <w:r>
           <w:rPr>
             <w:rStyle w:val="Hyperlink"/>
@@ -18849,7 +18849,7 @@
       <w:r>
         <w:t xml:space="preserve">CoComelon YouTube stats &amp; earnings — vidIQ — </w:t>
       </w:r>
-      <w:hyperlink w:history="1" r:id="rIdraxhsiqwgmfxiqyae-dyq">
+      <w:hyperlink w:history="1" r:id="rIdt_5abtsbmcmfbrilzhcqx">
         <w:r>
           <w:rPr>
             <w:rStyle w:val="Hyperlink"/>
@@ -18865,7 +18865,7 @@
       <w:r>
         <w:t xml:space="preserve">10 Best Board Books With Rhythm, Rhyming &amp; Repetition — Full Green Life — </w:t>
       </w:r>
-      <w:hyperlink w:history="1" r:id="rIdg01fo9ecjhbhbnujlzh7h">
+      <w:hyperlink w:history="1" r:id="rId7fsd838wuolema614u-hn">
         <w:r>
           <w:rPr>
             <w:rStyle w:val="Hyperlink"/>
@@ -18881,7 +18881,7 @@
       <w:r>
         <w:t xml:space="preserve">Google Ads AI Agent: Complete 2025 Guide — Synter — </w:t>
       </w:r>
-      <w:hyperlink w:history="1" r:id="rIdyotq2n9mu10pmh_fhrzr9">
+      <w:hyperlink w:history="1" r:id="rIdse3cpeou8o-11syg59apa">
         <w:r>
           <w:rPr>
             <w:rStyle w:val="Hyperlink"/>
@@ -18897,7 +18897,7 @@
       <w:r>
         <w:t xml:space="preserve">Google Ads Automation: The Complete Guide for 2025 — Adspirer — </w:t>
       </w:r>
-      <w:hyperlink w:history="1" r:id="rIdrezqsgjkws618vpreuhdz">
+      <w:hyperlink w:history="1" r:id="rIdhs-nvop4b7ourxolvnby9">
         <w:r>
           <w:rPr>
             <w:rStyle w:val="Hyperlink"/>
@@ -18913,7 +18913,7 @@
       <w:r>
         <w:t xml:space="preserve">Agentic Marketing: AI Runs the Campaign, Harnessed by Humans — Treasure — </w:t>
       </w:r>
-      <w:hyperlink w:history="1" r:id="rId45v5gpvoluk8uujnfah4i">
+      <w:hyperlink w:history="1" r:id="rIdpkv14fwxvtuqwmcrcko28">
         <w:r>
           <w:rPr>
             <w:rStyle w:val="Hyperlink"/>
@@ -18929,7 +18929,7 @@
       <w:r>
         <w:t xml:space="preserve">Guardrails for AI: A Marketer's Guide to Governing AI Systems — CleverTap — </w:t>
       </w:r>
-      <w:hyperlink w:history="1" r:id="rIddq_fclm0euqq5kvvydgpc">
+      <w:hyperlink w:history="1" r:id="rIdf5gbkrvvar4v1o-i9v0od">
         <w:r>
           <w:rPr>
             <w:rStyle w:val="Hyperlink"/>
@@ -18945,7 +18945,7 @@
       <w:r>
         <w:t xml:space="preserve">A Writer's Toolkit for Writing Great Rhyming Books for Kids — Children's Book Mastery — </w:t>
       </w:r>
-      <w:hyperlink w:history="1" r:id="rIdq-3ndegsfnhsu4qexyb3p">
+      <w:hyperlink w:history="1" r:id="rIduehv4gfurosdpf6hdeu0q">
         <w:r>
           <w:rPr>
             <w:rStyle w:val="Hyperlink"/>
@@ -18961,7 +18961,7 @@
       <w:r>
         <w:t xml:space="preserve">Writing Picture Books: Rhyming Is All About Rhythm (Josh Funk) — </w:t>
       </w:r>
-      <w:hyperlink w:history="1" r:id="rIdi0yxnjcaqs1nmxmv6jxpi">
+      <w:hyperlink w:history="1" r:id="rId9-374gck53hkocagzr_uo">
         <w:r>
           <w:rPr>
             <w:rStyle w:val="Hyperlink"/>
@@ -18977,7 +18977,7 @@
       <w:r>
         <w:t xml:space="preserve">BookBeam — market research &amp; BSR/sales estimates for KDP — </w:t>
       </w:r>
-      <w:hyperlink w:history="1" r:id="rIdl55uzry5extvu0ronlhfu">
+      <w:hyperlink w:history="1" r:id="rIdipedc2shf25ts-kvepchy">
         <w:r>
           <w:rPr>
             <w:rStyle w:val="Hyperlink"/>
@@ -18993,7 +18993,7 @@
       <w:r>
         <w:t xml:space="preserve">Book Bolt — Book Scout &amp; KDP Spy (competitor ASIN keyword/BSR research) — </w:t>
       </w:r>
-      <w:hyperlink w:history="1" r:id="rIdcyja7f2nzdhwjuy-7yvg8">
+      <w:hyperlink w:history="1" r:id="rIdhnela-9q3j68bs-wvd--0">
         <w:r>
           <w:rPr>
             <w:rStyle w:val="Hyperlink"/>
@@ -19009,7 +19009,7 @@
       <w:r>
         <w:t xml:space="preserve">Amazon KDP Niche Research: 5 Tools for Profitable Books — AI4Writers — </w:t>
       </w:r>
-      <w:hyperlink w:history="1" r:id="rIdsnrykm4d--pstcm5rgvgb">
+      <w:hyperlink w:history="1" r:id="rId6-wbbpafu3oab5afv-obj">
         <w:r>
           <w:rPr>
             <w:rStyle w:val="Hyperlink"/>
@@ -19025,7 +19025,7 @@
       <w:r>
         <w:t xml:space="preserve">BISAC Juvenile Fiction subject/age categories — Book Industry Study Group — </w:t>
       </w:r>
-      <w:hyperlink w:history="1" r:id="rIdax53nt0h1qis9dxl8vrov">
+      <w:hyperlink w:history="1" r:id="rIdsx4g6j7ofg07fpj6sp_yx">
         <w:r>
           <w:rPr>
             <w:rStyle w:val="Hyperlink"/>
@@ -19041,7 +19041,7 @@
       <w:r>
         <w:t xml:space="preserve">Children's Book Word Count by Age Group — Write for Kids — </w:t>
       </w:r>
-      <w:hyperlink w:history="1" r:id="rIdesiormi5cbjsjr_n9sb2z">
+      <w:hyperlink w:history="1" r:id="rIdpcaxx9slwz1lgem2peram">
         <w:r>
           <w:rPr>
             <w:rStyle w:val="Hyperlink"/>
@@ -19057,7 +19057,7 @@
       <w:r>
         <w:t xml:space="preserve">Children's Book Length Guidelines — Mary Kole Editorial — </w:t>
       </w:r>
-      <w:hyperlink w:history="1" r:id="rIdjguwuzqmtrbtgtdwaindr">
+      <w:hyperlink w:history="1" r:id="rId2i7olue2j1ntiomtby7bz">
         <w:r>
           <w:rPr>
             <w:rStyle w:val="Hyperlink"/>
@@ -19073,7 +19073,7 @@
       <w:r>
         <w:t xml:space="preserve">KDP — Primary Audience and Reading Age — </w:t>
       </w:r>
-      <w:hyperlink w:history="1" r:id="rIdmla2c0kze_d4sedn_cajv">
+      <w:hyperlink w:history="1" r:id="rId1dejetioxz-m8_ni5glum">
         <w:r>
           <w:rPr>
             <w:rStyle w:val="Hyperlink"/>
@@ -19089,7 +19089,7 @@
       <w:r>
         <w:t xml:space="preserve">Children's Books — CPSC (CPSIA exemption &amp; lead limits) — </w:t>
       </w:r>
-      <w:hyperlink w:history="1" r:id="rIdil9rv04xvcjgwuecdin_w">
+      <w:hyperlink w:history="1" r:id="rIdalsqgau51pcy3loqwzhwt">
         <w:r>
           <w:rPr>
             <w:rStyle w:val="Hyperlink"/>
@@ -19105,7 +19105,7 @@
       <w:r>
         <w:t xml:space="preserve">Children's Book Regulations in the United States — Compliance Gate — </w:t>
       </w:r>
-      <w:hyperlink w:history="1" r:id="rIdg4vatqdscyybjmbk0g_4j">
+      <w:hyperlink w:history="1" r:id="rIdbffcnhhkf1bupgi4csyvs">
         <w:r>
           <w:rPr>
             <w:rStyle w:val="Hyperlink"/>

</xml_diff>